<commit_message>
Fix GitHub language statistics
</commit_message>
<xml_diff>
--- a/assets/Julius Karnwie Resume.pdf.docx
+++ b/assets/Julius Karnwie Resume.pdf.docx
@@ -26,126 +26,18 @@
           <w:sz w:val="21"/>
           <w:szCs w:val="21"/>
         </w:rPr>
-        <w:t xml:space="preserve">Junior Frontend </w:t>
-      </w:r>
-      <w:proofErr w:type="gramStart"/>
+        <w:t>Junior Frontend Developer  |  React  |  Next.js  |  TypeScript  |  Tailwind CSS</w:t>
+      </w:r>
+    </w:p>
+    <w:p>
+      <w:pPr>
+        <w:spacing w:after="50"/>
+      </w:pPr>
       <w:r>
         <w:rPr>
           <w:color w:val="444444"/>
-          <w:sz w:val="21"/>
-          <w:szCs w:val="21"/>
-        </w:rPr>
-        <w:t>Developer  |</w:t>
-      </w:r>
-      <w:proofErr w:type="gramEnd"/>
-      <w:r>
-        <w:rPr>
-          <w:color w:val="444444"/>
-          <w:sz w:val="21"/>
-          <w:szCs w:val="21"/>
-        </w:rPr>
-        <w:t xml:space="preserve">  </w:t>
-      </w:r>
-      <w:proofErr w:type="gramStart"/>
-      <w:r>
-        <w:rPr>
-          <w:color w:val="444444"/>
-          <w:sz w:val="21"/>
-          <w:szCs w:val="21"/>
-        </w:rPr>
-        <w:t>React  |</w:t>
-      </w:r>
-      <w:proofErr w:type="gramEnd"/>
-      <w:r>
-        <w:rPr>
-          <w:color w:val="444444"/>
-          <w:sz w:val="21"/>
-          <w:szCs w:val="21"/>
-        </w:rPr>
-        <w:t xml:space="preserve">  </w:t>
-      </w:r>
-      <w:proofErr w:type="gramStart"/>
-      <w:r>
-        <w:rPr>
-          <w:color w:val="444444"/>
-          <w:sz w:val="21"/>
-          <w:szCs w:val="21"/>
-        </w:rPr>
-        <w:t>Next.js  |</w:t>
-      </w:r>
-      <w:proofErr w:type="gramEnd"/>
-      <w:r>
-        <w:rPr>
-          <w:color w:val="444444"/>
-          <w:sz w:val="21"/>
-          <w:szCs w:val="21"/>
-        </w:rPr>
-        <w:t xml:space="preserve">  </w:t>
-      </w:r>
-      <w:proofErr w:type="gramStart"/>
-      <w:r>
-        <w:rPr>
-          <w:color w:val="444444"/>
-          <w:sz w:val="21"/>
-          <w:szCs w:val="21"/>
-        </w:rPr>
-        <w:t>TypeScript  |</w:t>
-      </w:r>
-      <w:proofErr w:type="gramEnd"/>
-      <w:r>
-        <w:rPr>
-          <w:color w:val="444444"/>
-          <w:sz w:val="21"/>
-          <w:szCs w:val="21"/>
-        </w:rPr>
-        <w:t xml:space="preserve">  Tailwind CSS</w:t>
-      </w:r>
-    </w:p>
-    <w:p>
-      <w:pPr>
-        <w:spacing w:after="50"/>
-      </w:pPr>
-      <w:proofErr w:type="gramStart"/>
-      <w:r>
-        <w:rPr>
-          <w:color w:val="444444"/>
-        </w:rPr>
-        <w:t>jkarnwie2000@yahoo.com  |</w:t>
-      </w:r>
-      <w:proofErr w:type="gramEnd"/>
-      <w:r>
-        <w:rPr>
-          <w:color w:val="444444"/>
-        </w:rPr>
-        <w:t xml:space="preserve">  540-314-</w:t>
-      </w:r>
-      <w:proofErr w:type="gramStart"/>
-      <w:r>
-        <w:rPr>
-          <w:color w:val="444444"/>
-        </w:rPr>
-        <w:t>5008  |</w:t>
-      </w:r>
-      <w:proofErr w:type="gramEnd"/>
-      <w:r>
-        <w:rPr>
-          <w:color w:val="444444"/>
-        </w:rPr>
-        <w:t xml:space="preserve">  Roanoke, </w:t>
-      </w:r>
-      <w:proofErr w:type="gramStart"/>
-      <w:r>
-        <w:rPr>
-          <w:color w:val="444444"/>
-        </w:rPr>
-        <w:t>VA  |</w:t>
-      </w:r>
-      <w:proofErr w:type="gramEnd"/>
-      <w:r>
-        <w:rPr>
-          <w:color w:val="444444"/>
-        </w:rPr>
-        <w:t xml:space="preserve">  </w:t>
+        </w:rPr>
+        <w:t xml:space="preserve">jkarnwie2000@yahoo.com  |  540-314-5008  |  Roanoke, VA  |  </w:t>
       </w:r>
       <w:hyperlink r:id="rId5" w:history="1">
         <w:r>
@@ -227,21 +119,7 @@
         <w:rPr>
           <w:color w:val="444444"/>
         </w:rPr>
-        <w:t xml:space="preserve">Junior Frontend Developer building responsive web applications with React, TypeScript, Next.js, and Tailwind CSS. Frontend Simplified graduate with deployed projects backed by REST API integration and a Git and GitHub workflow, with automated linting through GitHub Actions and component tests in </w:t>
-      </w:r>
-      <w:proofErr w:type="spellStart"/>
-      <w:r>
-        <w:rPr>
-          <w:color w:val="444444"/>
-        </w:rPr>
-        <w:t>Vitest</w:t>
-      </w:r>
-      <w:proofErr w:type="spellEnd"/>
-      <w:r>
-        <w:rPr>
-          <w:color w:val="444444"/>
-        </w:rPr>
-        <w:t xml:space="preserve"> and React Testing Library. Nearly two years in a credit union contact center bring clear communication, close attention to detail, and a user-first mindset.</w:t>
+        <w:t>Junior Frontend Developer building responsive web applications with React, TypeScript, Next.js, and Tailwind CSS. Frontend Simplified graduate with deployed projects backed by REST API integration and a Git and GitHub workflow, with automated linting through GitHub Actions and component tests in Vitest and React Testing Library. Nearly two years in a credit union contact center bring clear communication, close attention to detail, and a user-first mindset.</w:t>
       </w:r>
     </w:p>
     <w:p>
@@ -316,21 +194,7 @@
         <w:rPr>
           <w:color w:val="444444"/>
         </w:rPr>
-        <w:t xml:space="preserve">REST APIs (fetch / </w:t>
-      </w:r>
-      <w:proofErr w:type="spellStart"/>
-      <w:r>
-        <w:rPr>
-          <w:color w:val="444444"/>
-        </w:rPr>
-        <w:t>axios</w:t>
-      </w:r>
-      <w:proofErr w:type="spellEnd"/>
-      <w:r>
-        <w:rPr>
-          <w:color w:val="444444"/>
-        </w:rPr>
-        <w:t>), Firebase</w:t>
+        <w:t>REST APIs (fetch / axios), Firebase</w:t>
       </w:r>
     </w:p>
     <w:p>
@@ -345,42 +209,12 @@
         </w:rPr>
         <w:t xml:space="preserve">Testing &amp; Tooling: </w:t>
       </w:r>
-      <w:proofErr w:type="spellStart"/>
       <w:r>
         <w:rPr>
           <w:color w:val="444444"/>
         </w:rPr>
-        <w:t>Vitest</w:t>
-      </w:r>
-      <w:proofErr w:type="spellEnd"/>
-      <w:r>
-        <w:rPr>
-          <w:color w:val="444444"/>
-        </w:rPr>
-        <w:t xml:space="preserve">, React Testing Library, GitHub Actions (linting), Git, GitHub, </w:t>
-      </w:r>
-      <w:proofErr w:type="spellStart"/>
-      <w:r>
-        <w:rPr>
-          <w:color w:val="444444"/>
-        </w:rPr>
-        <w:t>npm</w:t>
-      </w:r>
-      <w:proofErr w:type="spellEnd"/>
-      <w:r>
-        <w:rPr>
-          <w:color w:val="444444"/>
-        </w:rPr>
-        <w:t xml:space="preserve">, </w:t>
-      </w:r>
-      <w:proofErr w:type="spellStart"/>
-      <w:r>
-        <w:rPr>
-          <w:color w:val="444444"/>
-        </w:rPr>
-        <w:t>Vercel</w:t>
-      </w:r>
-      <w:proofErr w:type="spellEnd"/>
+        <w:t>Vitest, React Testing Library, GitHub Actions (linting), Git, GitHub, npm, Vercel</w:t>
+      </w:r>
     </w:p>
     <w:p>
       <w:pPr>
@@ -407,7 +241,6 @@
         </w:tabs>
         <w:spacing w:before="170" w:after="28"/>
       </w:pPr>
-      <w:proofErr w:type="spellStart"/>
       <w:r>
         <w:rPr>
           <w:b/>
@@ -416,18 +249,7 @@
           <w:sz w:val="21"/>
           <w:szCs w:val="21"/>
         </w:rPr>
-        <w:t>Karnwie's</w:t>
-      </w:r>
-      <w:proofErr w:type="spellEnd"/>
-      <w:r>
-        <w:rPr>
-          <w:b/>
-          <w:bCs/>
-          <w:color w:val="1A1A1A"/>
-          <w:sz w:val="21"/>
-          <w:szCs w:val="21"/>
-        </w:rPr>
-        <w:t xml:space="preserve"> Golden Websites (Roanoke, VA)</w:t>
+        <w:t>Karnwie's Golden Websites (Roanoke, VA)</w:t>
       </w:r>
       <w:r>
         <w:rPr>
@@ -463,21 +285,7 @@
         <w:rPr>
           <w:color w:val="1A1A1A"/>
         </w:rPr>
-        <w:t xml:space="preserve">Built and deployed responsive, mobile-first websites for small businesses and nonprofits using HTML5, CSS3, and JavaScript, shipped on </w:t>
-      </w:r>
-      <w:proofErr w:type="spellStart"/>
-      <w:r>
-        <w:rPr>
-          <w:color w:val="1A1A1A"/>
-        </w:rPr>
-        <w:t>Vercel</w:t>
-      </w:r>
-      <w:proofErr w:type="spellEnd"/>
-      <w:r>
-        <w:rPr>
-          <w:color w:val="1A1A1A"/>
-        </w:rPr>
-        <w:t>.</w:t>
+        <w:t>Built and deployed responsive, mobile-first websites for small businesses and nonprofits using HTML5, CSS3, and JavaScript, shipped on Vercel.</w:t>
       </w:r>
     </w:p>
     <w:p>
@@ -503,7 +311,6 @@
         </w:tabs>
         <w:spacing w:before="170" w:after="28"/>
       </w:pPr>
-      <w:proofErr w:type="spellStart"/>
       <w:r>
         <w:rPr>
           <w:b/>
@@ -512,18 +319,7 @@
           <w:sz w:val="21"/>
           <w:szCs w:val="21"/>
         </w:rPr>
-        <w:t>Skinstric</w:t>
-      </w:r>
-      <w:proofErr w:type="spellEnd"/>
-      <w:r>
-        <w:rPr>
-          <w:b/>
-          <w:bCs/>
-          <w:color w:val="1A1A1A"/>
-          <w:sz w:val="21"/>
-          <w:szCs w:val="21"/>
-        </w:rPr>
-        <w:t xml:space="preserve"> AI (Remote)</w:t>
+        <w:t>Skinstric AI (Remote)</w:t>
       </w:r>
       <w:r>
         <w:rPr>
@@ -591,21 +387,7 @@
         <w:rPr>
           <w:color w:val="1A1A1A"/>
         </w:rPr>
-        <w:t xml:space="preserve">Added a GitHub Actions workflow that runs </w:t>
-      </w:r>
-      <w:proofErr w:type="spellStart"/>
-      <w:r>
-        <w:rPr>
-          <w:color w:val="1A1A1A"/>
-        </w:rPr>
-        <w:t>ESLint</w:t>
-      </w:r>
-      <w:proofErr w:type="spellEnd"/>
-      <w:r>
-        <w:rPr>
-          <w:color w:val="1A1A1A"/>
-        </w:rPr>
-        <w:t xml:space="preserve"> on every push and pull request.</w:t>
+        <w:t>Added a GitHub Actions workflow that runs ESLint on every push and pull request.</w:t>
       </w:r>
     </w:p>
     <w:p>
@@ -690,29 +472,13 @@
           <w:bCs/>
           <w:color w:val="1A1A1A"/>
         </w:rPr>
-        <w:t xml:space="preserve">Summarist Book Summary </w:t>
-      </w:r>
-      <w:proofErr w:type="gramStart"/>
-      <w:r>
-        <w:rPr>
-          <w:b/>
-          <w:bCs/>
-          <w:color w:val="1A1A1A"/>
-        </w:rPr>
-        <w:t xml:space="preserve">Platform  </w:t>
+        <w:t xml:space="preserve">Summarist Book Summary Platform  </w:t>
       </w:r>
       <w:r>
         <w:rPr>
           <w:color w:val="777777"/>
         </w:rPr>
-        <w:t>|</w:t>
-      </w:r>
-      <w:proofErr w:type="gramEnd"/>
-      <w:r>
-        <w:rPr>
-          <w:color w:val="777777"/>
-        </w:rPr>
-        <w:t xml:space="preserve">  </w:t>
+        <w:t xml:space="preserve">|  </w:t>
       </w:r>
       <w:hyperlink r:id="rId8" w:history="1">
         <w:r>
@@ -752,66 +518,26 @@
         <w:rPr>
           <w:color w:val="1A1A1A"/>
         </w:rPr>
-        <w:t xml:space="preserve">Next.js, TypeScript, Firebase, Tailwind CSS, Redux Toolkit: </w:t>
-      </w:r>
-      <w:proofErr w:type="spellStart"/>
-      <w:r>
-        <w:rPr>
-          <w:color w:val="1A1A1A"/>
-        </w:rPr>
-        <w:t>personalised</w:t>
-      </w:r>
-      <w:proofErr w:type="spellEnd"/>
-      <w:r>
-        <w:rPr>
-          <w:color w:val="1A1A1A"/>
-        </w:rPr>
-        <w:t xml:space="preserve"> recommendations, audio summaries, user login.</w:t>
+        <w:t>Next.js, TypeScript, Firebase, Tailwind CSS, Redux Toolkit: personalised recommendations, audio summaries, user login.</w:t>
       </w:r>
     </w:p>
     <w:p>
       <w:pPr>
         <w:spacing w:before="140" w:after="32"/>
       </w:pPr>
-      <w:proofErr w:type="spellStart"/>
       <w:r>
         <w:rPr>
           <w:b/>
           <w:bCs/>
           <w:color w:val="1A1A1A"/>
         </w:rPr>
-        <w:t>Ultraverse</w:t>
-      </w:r>
-      <w:proofErr w:type="spellEnd"/>
-      <w:r>
-        <w:rPr>
-          <w:b/>
-          <w:bCs/>
-          <w:color w:val="1A1A1A"/>
-        </w:rPr>
-        <w:t xml:space="preserve"> NFT </w:t>
-      </w:r>
-      <w:proofErr w:type="gramStart"/>
-      <w:r>
-        <w:rPr>
-          <w:b/>
-          <w:bCs/>
-          <w:color w:val="1A1A1A"/>
-        </w:rPr>
-        <w:t xml:space="preserve">Marketplace  </w:t>
+        <w:t xml:space="preserve">Ultraverse NFT Marketplace  </w:t>
       </w:r>
       <w:r>
         <w:rPr>
           <w:color w:val="777777"/>
         </w:rPr>
-        <w:t>|</w:t>
-      </w:r>
-      <w:proofErr w:type="gramEnd"/>
-      <w:r>
-        <w:rPr>
-          <w:color w:val="777777"/>
-        </w:rPr>
-        <w:t xml:space="preserve">  </w:t>
+        <w:t xml:space="preserve">|  </w:t>
       </w:r>
       <w:hyperlink r:id="rId10" w:history="1">
         <w:r>
@@ -863,29 +589,13 @@
           <w:bCs/>
           <w:color w:val="1A1A1A"/>
         </w:rPr>
-        <w:t xml:space="preserve">Books E-commerce </w:t>
-      </w:r>
-      <w:proofErr w:type="gramStart"/>
-      <w:r>
-        <w:rPr>
-          <w:b/>
-          <w:bCs/>
-          <w:color w:val="1A1A1A"/>
-        </w:rPr>
-        <w:t xml:space="preserve">Store  </w:t>
+        <w:t xml:space="preserve">Books E-commerce Store  </w:t>
       </w:r>
       <w:r>
         <w:rPr>
           <w:color w:val="777777"/>
         </w:rPr>
-        <w:t>|</w:t>
-      </w:r>
-      <w:proofErr w:type="gramEnd"/>
-      <w:r>
-        <w:rPr>
-          <w:color w:val="777777"/>
-        </w:rPr>
-        <w:t xml:space="preserve">  </w:t>
+        <w:t xml:space="preserve">|  </w:t>
       </w:r>
       <w:hyperlink r:id="rId12" w:history="1">
         <w:r>
@@ -930,21 +640,7 @@
         <w:rPr>
           <w:color w:val="1A1A1A"/>
         </w:rPr>
-        <w:t xml:space="preserve">React and React Router: cart with subtotal, tax, and total, sort by price and rating, and 15 component render tests in </w:t>
-      </w:r>
-      <w:proofErr w:type="spellStart"/>
-      <w:r>
-        <w:rPr>
-          <w:color w:val="1A1A1A"/>
-        </w:rPr>
-        <w:t>Vitest</w:t>
-      </w:r>
-      <w:proofErr w:type="spellEnd"/>
-      <w:r>
-        <w:rPr>
-          <w:color w:val="1A1A1A"/>
-        </w:rPr>
-        <w:t xml:space="preserve"> and React Testing Library.</w:t>
+        <w:t>React and React Router: cart with subtotal, tax, and total, sort by price and rating, and 15 component render tests in Vitest and React Testing Library.</w:t>
       </w:r>
     </w:p>
     <w:p>

</xml_diff>